<commit_message>
Double the backend kit to 736 questions and add a SQL practice file
Co-Authored-By: Claude Opus 5.5 <noreply@anthropic.com>
Claude-Session: https://claude.ai/code/session_015XUNUKPXGTZTYLE5hP9Ue5
</commit_message>
<xml_diff>
--- a/backend-google-docs/00-README.docx
+++ b/backend-google-docs/00-README.docx
@@ -15,6 +15,21 @@
       <w:r>
         <w:rPr/>
         <w:t>The backend companion to the Frontend Interview Kit, built around the backend side of your updated full-stack resume: Node.js, Express.js, NestJS, REST and GraphQL, PostgreSQL, MongoDB and Redis, FastAPI and Celery, the AI scoring pipeline (40,000+ calls a month), real-time video infrastructure (LiveKit on AWS), security (RBAC, JWT/OAuth, PHI), Docker, AWS, GitHub Actions, Sentry, Grafana and Prometheus.</w:t>
+      </w:r>
+    </w:p>
+    <w:p>
+      <w:r>
+        <w:rPr/>
+      </w:r>
+      <w:r>
+        <w:rPr>
+          <w:b/>
+        </w:rPr>
+        <w:t>736 questions across 19 topic files</w:t>
+      </w:r>
+      <w:r>
+        <w:rPr/>
+        <w:t>, every one with all four answer parts.</w:t>
       </w:r>
     </w:p>
     <w:p>
@@ -633,7 +648,7 @@
               <w:rPr>
                 <w:sz w:val="20"/>
               </w:rPr>
-              <w:t>18 Backend Coding Round, 16 Testing</w:t>
+              <w:t>18 Backend Coding Round, 20 SQL Practice, 16 Testing</w:t>
             </w:r>
           </w:p>
         </w:tc>
@@ -649,7 +664,7 @@
               <w:rPr>
                 <w:sz w:val="20"/>
               </w:rPr>
-              <w:t>Live coding rounds</w:t>
+              <w:t>Live coding and SQL rounds</w:t>
             </w:r>
           </w:p>
         </w:tc>
@@ -1568,7 +1583,7 @@
               <w:rPr>
                 <w:sz w:val="20"/>
               </w:rPr>
-              <w:t>Framework, concepts and 8 worked designs</w:t>
+              <w:t>Framework, concepts and 14 worked designs</w:t>
             </w:r>
           </w:p>
         </w:tc>
@@ -1878,6 +1893,56 @@
                 <w:sz w:val="20"/>
               </w:rPr>
               <w:t>One cheat sheet per topic</w:t>
+            </w:r>
+          </w:p>
+        </w:tc>
+      </w:tr>
+      <w:tr>
+        <w:tc>
+          <w:tcPr>
+            <w:tcW w:type="dxa" w:w="3324"/>
+          </w:tcPr>
+          <w:p>
+            <w:pPr>
+              <w:spacing w:after="0"/>
+            </w:pPr>
+            <w:r>
+              <w:rPr>
+                <w:sz w:val="20"/>
+              </w:rPr>
+              <w:t>20</w:t>
+            </w:r>
+          </w:p>
+        </w:tc>
+        <w:tc>
+          <w:tcPr>
+            <w:tcW w:type="dxa" w:w="3324"/>
+          </w:tcPr>
+          <w:p>
+            <w:pPr>
+              <w:spacing w:after="0"/>
+            </w:pPr>
+            <w:r>
+              <w:rPr>
+                <w:sz w:val="20"/>
+              </w:rPr>
+              <w:t>sql-practice</w:t>
+            </w:r>
+          </w:p>
+        </w:tc>
+        <w:tc>
+          <w:tcPr>
+            <w:tcW w:type="dxa" w:w="3324"/>
+          </w:tcPr>
+          <w:p>
+            <w:pPr>
+              <w:spacing w:after="0"/>
+            </w:pPr>
+            <w:r>
+              <w:rPr>
+                <w:sz w:val="20"/>
+              </w:rPr>
+              <w:t>25 "write the query" problems on a BpoBox-style schema</w:t>
             </w:r>
           </w:p>
         </w:tc>

</xml_diff>